<commit_message>
Appréciation v3.4 : aperçu SharePoint sans téléchargement
L'aperçu SharePoint bloque les téléchargements sans erreur : « Copie locale »
et « Déposer » ne produisaient rien. Le bandeau indique maintenant d'ouvrir le
fichier sur le poste, et une fenêtre « Copier le contenu » évite toute perte.
Guide VERSION-3.4 et liste des tâches mis à jour (Word).

Co-Authored-By: Claude Opus 5.5 <noreply@anthropic.com>
Claude-Session: https://claude.ai/code/session_01FRdAzq8p3F9gJJe5MA3G79
</commit_message>
<xml_diff>
--- a/sharepoint-html-kit/appreciation/A-FAIRE-DEMAIN.docx
+++ b/sharepoint-html-kit/appreciation/A-FAIRE-DEMAIN.docx
@@ -2,22 +2,13 @@
 <file path=word/document.xml><?xml version="1.0" encoding="utf-8"?>
 <w:document xmlns:w="http://schemas.openxmlformats.org/wordprocessingml/2006/main" xmlns:m="http://schemas.openxmlformats.org/officeDocument/2006/math" xmlns:r="http://schemas.openxmlformats.org/officeDocument/2006/relationships" xmlns:o="urn:schemas-microsoft-com:office:office" xmlns:v="urn:schemas-microsoft-com:vml" xmlns:w10="urn:schemas-microsoft-com:office:word" xmlns:a="http://schemas.openxmlformats.org/drawingml/2006/main" xmlns:pic="http://schemas.openxmlformats.org/drawingml/2006/picture" xmlns:wp="http://schemas.openxmlformats.org/drawingml/2006/wordprocessingDrawing">
   <w:body>
-    <w:bookmarkStart w:id="26" w:name="à-faire-dans-lordre"/>
+    <w:bookmarkStart w:id="20" w:name="à-faire-dans-lordre"/>
     <w:p>
       <w:pPr>
         <w:pStyle w:val="Heading1"/>
       </w:pPr>
       <w:r>
         <w:t xml:space="preserve">À faire, dans l’ordre</w:t>
-      </w:r>
-    </w:p>
-    <w:bookmarkStart w:id="20" w:name="X152f8083aca645e217a0c9ff4cdcc98bedc26b8"/>
-    <w:p>
-      <w:pPr>
-        <w:pStyle w:val="Heading2"/>
-      </w:pPr>
-      <w:r>
-        <w:t xml:space="preserve">1. Déposer la dernière version de l’application (5 min)</w:t>
       </w:r>
     </w:p>
     <w:p>
@@ -29,7 +20,32 @@
         <w:pStyle w:val="Compact"/>
       </w:pPr>
       <w:r>
-        <w:t xml:space="preserve">Téléchargez le fichier</w:t>
+        <w:rPr>
+          <w:bCs/>
+          <w:b/>
+        </w:rPr>
+        <w:t xml:space="preserve">Remplacer le fichier.</w:t>
+      </w:r>
+      <w:r>
+        <w:t xml:space="preserve"> </w:t>
+      </w:r>
+      <w:r>
+        <w:t xml:space="preserve">Déposez</w:t>
+      </w:r>
+      <w:r>
+        <w:t xml:space="preserve"> </w:t>
+      </w:r>
+      <w:r>
+        <w:rPr>
+          <w:rStyle w:val="VerbatimChar"/>
+        </w:rPr>
+        <w:t xml:space="preserve">appreciation-cadres-v3.4.html</w:t>
+      </w:r>
+      <w:r>
+        <w:t xml:space="preserve"> </w:t>
+      </w:r>
+      <w:r>
+        <w:t xml:space="preserve">dans la bibliothèque. Supprimez ensuite l’ancien</w:t>
       </w:r>
       <w:r>
         <w:t xml:space="preserve"> </w:t>
@@ -44,7 +60,7 @@
         <w:t xml:space="preserve"> </w:t>
       </w:r>
       <w:r>
-        <w:t xml:space="preserve">reçu en dernier (celui avec le lien stable).</w:t>
+        <w:t xml:space="preserve">: le nom a changé, il n’y a donc rien à remplacer.</w:t>
       </w:r>
     </w:p>
     <w:p>
@@ -56,7 +72,14 @@
         <w:pStyle w:val="Compact"/>
       </w:pPr>
       <w:r>
-        <w:t xml:space="preserve">Déposez-le dans votre bibliothèque « Appréciation de la contribution des cadres ».</w:t>
+        <w:rPr>
+          <w:bCs/>
+          <w:b/>
+        </w:rPr>
+        <w:t xml:space="preserve">Créer la bibliothèque Dossiers_Appreciations</w:t>
+      </w:r>
+      <w:r>
+        <w:t xml:space="preserve">, si ce n’est pas déjà fait (guide ETAPE-1, partie B). La liste Depot_Appreciations est faite ✅.</w:t>
       </w:r>
     </w:p>
     <w:p>
@@ -68,20 +91,119 @@
         <w:pStyle w:val="Compact"/>
       </w:pPr>
       <w:r>
-        <w:t xml:space="preserve">Si un fichier du même nom existe : choisissez</w:t>
-      </w:r>
-      <w:r>
-        <w:t xml:space="preserve"> </w:t>
-      </w:r>
-      <w:r>
         <w:rPr>
           <w:bCs/>
           <w:b/>
         </w:rPr>
-        <w:t xml:space="preserve">Remplacer</w:t>
-      </w:r>
-      <w:r>
-        <w:t xml:space="preserve">. Ne supprimez pas l’ancien.</w:t>
+        <w:t xml:space="preserve">Tester sur le poste</w:t>
+      </w:r>
+      <w:r>
+        <w:t xml:space="preserve"> </w:t>
+      </w:r>
+      <w:r>
+        <w:t xml:space="preserve">(pas dans l’aperçu) :</w:t>
+      </w:r>
+    </w:p>
+    <w:p>
+      <w:pPr>
+        <w:numPr>
+          <w:ilvl w:val="1"/>
+          <w:numId w:val="1002"/>
+        </w:numPr>
+        <w:pStyle w:val="Compact"/>
+      </w:pPr>
+      <w:r>
+        <w:t xml:space="preserve">⤓ Télécharger le fichier depuis la bibliothèque, puis l’ouvrir ;</w:t>
+      </w:r>
+    </w:p>
+    <w:p>
+      <w:pPr>
+        <w:numPr>
+          <w:ilvl w:val="1"/>
+          <w:numId w:val="1002"/>
+        </w:numPr>
+        <w:pStyle w:val="Compact"/>
+      </w:pPr>
+      <w:r>
+        <w:t xml:space="preserve">créer le mot de passe ;</w:t>
+      </w:r>
+    </w:p>
+    <w:p>
+      <w:pPr>
+        <w:numPr>
+          <w:ilvl w:val="1"/>
+          <w:numId w:val="1002"/>
+        </w:numPr>
+        <w:pStyle w:val="Compact"/>
+      </w:pPr>
+      <w:r>
+        <w:t xml:space="preserve">💾 Copie locale : un fichier</w:t>
+      </w:r>
+      <w:r>
+        <w:t xml:space="preserve"> </w:t>
+      </w:r>
+      <w:r>
+        <w:rPr>
+          <w:rStyle w:val="VerbatimChar"/>
+        </w:rPr>
+        <w:t xml:space="preserve">.json</w:t>
+      </w:r>
+      <w:r>
+        <w:t xml:space="preserve"> </w:t>
+      </w:r>
+      <w:r>
+        <w:t xml:space="preserve">arrive dans Téléchargements ;</w:t>
+      </w:r>
+    </w:p>
+    <w:p>
+      <w:pPr>
+        <w:numPr>
+          <w:ilvl w:val="1"/>
+          <w:numId w:val="1002"/>
+        </w:numPr>
+        <w:pStyle w:val="Compact"/>
+      </w:pPr>
+      <w:r>
+        <w:t xml:space="preserve">☁️ Déposer sur SharePoint : un fichier</w:t>
+      </w:r>
+      <w:r>
+        <w:t xml:space="preserve"> </w:t>
+      </w:r>
+      <w:r>
+        <w:rPr>
+          <w:rStyle w:val="VerbatimChar"/>
+        </w:rPr>
+        <w:t xml:space="preserve">depot-….json</w:t>
+      </w:r>
+      <w:r>
+        <w:t xml:space="preserve"> </w:t>
+      </w:r>
+      <w:r>
+        <w:t xml:space="preserve">arrive ; ensuite « Ouvrir le formulaire de dépôt », joindre ce fichier et enregistrer ;</w:t>
+      </w:r>
+    </w:p>
+    <w:p>
+      <w:pPr>
+        <w:numPr>
+          <w:ilvl w:val="1"/>
+          <w:numId w:val="1002"/>
+        </w:numPr>
+        <w:pStyle w:val="Compact"/>
+      </w:pPr>
+      <w:r>
+        <w:t xml:space="preserve">📂 Ouvrir « Mes dossiers » ;</w:t>
+      </w:r>
+    </w:p>
+    <w:p>
+      <w:pPr>
+        <w:numPr>
+          <w:ilvl w:val="1"/>
+          <w:numId w:val="1002"/>
+        </w:numPr>
+        <w:pStyle w:val="Compact"/>
+      </w:pPr>
+      <w:r>
+        <w:t xml:space="preserve">🖨️ Aperçu PDF.</w:t>
       </w:r>
     </w:p>
     <w:p>
@@ -93,508 +215,72 @@
         <w:pStyle w:val="Compact"/>
       </w:pPr>
       <w:r>
-        <w:t xml:space="preserve">Ne modifiez pas le fichier dans le Bloc-notes : les adresses sont déjà inscrites.</w:t>
-      </w:r>
-    </w:p>
-    <w:bookmarkEnd w:id="20"/>
-    <w:bookmarkStart w:id="21" w:name="X4002cee928a7d97c566d425b046d879a873d52b"/>
-    <w:p>
-      <w:pPr>
-        <w:pStyle w:val="Heading2"/>
-      </w:pPr>
-      <w:r>
-        <w:t xml:space="preserve">2. Créer la liste de dépôt et la bibliothèque des dossiers (30 min)</w:t>
-      </w:r>
-    </w:p>
-    <w:p>
-      <w:pPr>
-        <w:pStyle w:val="FirstParagraph"/>
-      </w:pPr>
-      <w:r>
-        <w:t xml:space="preserve">Suivez</w:t>
-      </w:r>
-      <w:r>
-        <w:t xml:space="preserve"> </w:t>
-      </w:r>
-      <w:r>
         <w:rPr>
           <w:bCs/>
           <w:b/>
         </w:rPr>
-        <w:t xml:space="preserve">ETAPE-1-LISTE-ET-BIBLIOTHEQUE.docx</w:t>
-      </w:r>
-      <w:r>
-        <w:t xml:space="preserve">, clic par clic :</w:t>
+        <w:t xml:space="preserve">M’envoyer les résultats</w:t>
       </w:r>
       <w:r>
         <w:t xml:space="preserve"> </w:t>
       </w:r>
       <w:r>
-        <w:t xml:space="preserve">- liste</w:t>
-      </w:r>
-      <w:r>
-        <w:t xml:space="preserve"> </w:t>
-      </w:r>
+        <w:t xml:space="preserve">(✅ ou ❌, avec des captures). Ensuite, on construit le flux Power Automate « AC - Traiter un dépôt ».</w:t>
+      </w:r>
+    </w:p>
+    <w:p>
+      <w:pPr>
+        <w:numPr>
+          <w:ilvl w:val="0"/>
+          <w:numId w:val="1001"/>
+        </w:numPr>
+        <w:pStyle w:val="Compact"/>
+      </w:pPr>
       <w:r>
         <w:rPr>
           <w:bCs/>
           <w:b/>
         </w:rPr>
-        <w:t xml:space="preserve">Depot_Appreciations</w:t>
-      </w:r>
-      <w:r>
-        <w:t xml:space="preserve">, avec les pièces jointes activées ;</w:t>
-      </w:r>
-      <w:r>
-        <w:t xml:space="preserve"> </w:t>
-      </w:r>
-      <w:r>
-        <w:t xml:space="preserve">- bibliothèque</w:t>
-      </w:r>
-      <w:r>
-        <w:t xml:space="preserve"> </w:t>
-      </w:r>
-      <w:r>
-        <w:rPr>
-          <w:bCs/>
-          <w:b/>
-        </w:rPr>
-        <w:t xml:space="preserve">Dossiers_Appreciations</w:t>
-      </w:r>
-      <w:r>
-        <w:t xml:space="preserve">, avec ses 6 colonnes et ses versions.</w:t>
+        <w:t xml:space="preserve">Répondre aux 3 questions :</w:t>
       </w:r>
     </w:p>
     <w:p>
       <w:pPr>
-        <w:pStyle w:val="BodyText"/>
-      </w:pPr>
-      <w:r>
-        <w:t xml:space="preserve">Les noms doivent être écrits</w:t>
-      </w:r>
-      <w:r>
-        <w:t xml:space="preserve"> </w:t>
-      </w:r>
-      <w:r>
-        <w:rPr>
-          <w:bCs/>
-          <w:b/>
-        </w:rPr>
-        <w:t xml:space="preserve">à la lettre</w:t>
-      </w:r>
-      <w:r>
-        <w:t xml:space="preserve">, avec les majuscules et le trait de soulignement.</w:t>
-      </w:r>
-    </w:p>
-    <w:bookmarkEnd w:id="21"/>
-    <w:bookmarkStart w:id="22" w:name="tester-dans-sharepoint-10-min"/>
-    <w:p>
-      <w:pPr>
-        <w:pStyle w:val="Heading2"/>
-      </w:pPr>
-      <w:r>
-        <w:t xml:space="preserve">3. Tester dans SharePoint (10 min)</w:t>
-      </w:r>
-    </w:p>
-    <w:p>
-      <w:pPr>
-        <w:pStyle w:val="FirstParagraph"/>
-      </w:pPr>
-      <w:r>
-        <w:t xml:space="preserve">Ouvrez le fichier depuis la bibliothèque et notez ✅ ou ❌ pour chaque point :</w:t>
-      </w:r>
-      <w:r>
-        <w:t xml:space="preserve"> </w:t>
-      </w:r>
-      <w:r>
-        <w:t xml:space="preserve">- l’application s’ouvre</w:t>
-      </w:r>
-      <w:r>
-        <w:t xml:space="preserve"> </w:t>
-      </w:r>
-      <w:r>
-        <w:rPr>
-          <w:bCs/>
-          <w:b/>
-        </w:rPr>
-        <w:t xml:space="preserve">sans</w:t>
-      </w:r>
-      <w:r>
-        <w:t xml:space="preserve"> </w:t>
-      </w:r>
-      <w:r>
-        <w:t xml:space="preserve">écran de mot de passe, avec le bandeau jaune ;</w:t>
-      </w:r>
-      <w:r>
-        <w:t xml:space="preserve"> </w:t>
-      </w:r>
-      <w:r>
-        <w:t xml:space="preserve">- vous choisissez un type de poste et remplissez un champ ;</w:t>
-      </w:r>
-      <w:r>
-        <w:t xml:space="preserve"> </w:t>
-      </w:r>
-      <w:r>
-        <w:t xml:space="preserve">-</w:t>
-      </w:r>
-      <w:r>
-        <w:t xml:space="preserve"> </w:t>
-      </w:r>
-      <w:r>
-        <w:rPr>
-          <w:bCs/>
-          <w:b/>
-        </w:rPr>
-        <w:t xml:space="preserve">💾 Copie locale</w:t>
-      </w:r>
-      <w:r>
-        <w:t xml:space="preserve"> </w:t>
-      </w:r>
-      <w:r>
-        <w:t xml:space="preserve">: un fichier</w:t>
-      </w:r>
-      <w:r>
-        <w:t xml:space="preserve"> </w:t>
-      </w:r>
-      <w:r>
-        <w:rPr>
-          <w:rStyle w:val="VerbatimChar"/>
-        </w:rPr>
-        <w:t xml:space="preserve">.json</w:t>
-      </w:r>
-      <w:r>
-        <w:t xml:space="preserve"> </w:t>
-      </w:r>
-      <w:r>
-        <w:t xml:space="preserve">arrive dans vos Téléchargements ;</w:t>
-      </w:r>
-      <w:r>
-        <w:t xml:space="preserve"> </w:t>
-      </w:r>
-      <w:r>
-        <w:t xml:space="preserve">- vous actualisez la page (F5), puis</w:t>
-      </w:r>
-      <w:r>
-        <w:t xml:space="preserve"> </w:t>
-      </w:r>
-      <w:r>
-        <w:rPr>
-          <w:bCs/>
-          <w:b/>
-        </w:rPr>
-        <w:t xml:space="preserve">📁 Charger un dossier</w:t>
-      </w:r>
-      <w:r>
-        <w:t xml:space="preserve"> </w:t>
-      </w:r>
-      <w:r>
-        <w:t xml:space="preserve">avec ce fichier : les données reviennent ;</w:t>
-      </w:r>
-      <w:r>
-        <w:t xml:space="preserve"> </w:t>
-      </w:r>
-      <w:r>
-        <w:t xml:space="preserve">-</w:t>
-      </w:r>
-      <w:r>
-        <w:t xml:space="preserve"> </w:t>
-      </w:r>
-      <w:r>
-        <w:rPr>
-          <w:bCs/>
-          <w:b/>
-        </w:rPr>
-        <w:t xml:space="preserve">☁️ Déposer sur SharePoint</w:t>
-      </w:r>
-      <w:r>
-        <w:t xml:space="preserve">, puis</w:t>
-      </w:r>
-      <w:r>
-        <w:t xml:space="preserve"> </w:t>
-      </w:r>
-      <w:r>
-        <w:rPr>
-          <w:bCs/>
-          <w:b/>
-        </w:rPr>
-        <w:t xml:space="preserve">Ouvrir le formulaire de dépôt</w:t>
-      </w:r>
-      <w:r>
-        <w:t xml:space="preserve"> </w:t>
-      </w:r>
-      <w:r>
-        <w:t xml:space="preserve">: le formulaire de la liste s’ouvre, avec « Ajouter des pièces jointes » ;</w:t>
-      </w:r>
-      <w:r>
-        <w:t xml:space="preserve"> </w:t>
-      </w:r>
-      <w:r>
-        <w:t xml:space="preserve">-</w:t>
-      </w:r>
-      <w:r>
-        <w:t xml:space="preserve"> </w:t>
-      </w:r>
-      <w:r>
-        <w:rPr>
-          <w:bCs/>
-          <w:b/>
-        </w:rPr>
-        <w:t xml:space="preserve">📂 Ouvrir « Mes dossiers »</w:t>
-      </w:r>
-      <w:r>
-        <w:t xml:space="preserve"> </w:t>
-      </w:r>
-      <w:r>
-        <w:t xml:space="preserve">: la bibliothèque Dossiers_Appreciations s’ouvre ;</w:t>
-      </w:r>
-      <w:r>
-        <w:t xml:space="preserve"> </w:t>
-      </w:r>
-      <w:r>
-        <w:t xml:space="preserve">-</w:t>
-      </w:r>
-      <w:r>
-        <w:t xml:space="preserve"> </w:t>
-      </w:r>
-      <w:r>
-        <w:rPr>
-          <w:bCs/>
-          <w:b/>
-        </w:rPr>
-        <w:t xml:space="preserve">🖨️ Aperçu PDF</w:t>
-      </w:r>
-      <w:r>
-        <w:t xml:space="preserve"> </w:t>
-      </w:r>
-      <w:r>
-        <w:t xml:space="preserve">: la fenêtre d’impression s’affiche ;</w:t>
-      </w:r>
-      <w:r>
-        <w:t xml:space="preserve"> </w:t>
-      </w:r>
-      <w:r>
-        <w:t xml:space="preserve">- Aide-mémoire ›</w:t>
-      </w:r>
-      <w:r>
-        <w:t xml:space="preserve"> </w:t>
-      </w:r>
-      <w:r>
-        <w:rPr>
-          <w:bCs/>
-          <w:b/>
-        </w:rPr>
-        <w:t xml:space="preserve">✉️ Envoyer</w:t>
-      </w:r>
-      <w:r>
-        <w:t xml:space="preserve"> </w:t>
-      </w:r>
-      <w:r>
-        <w:t xml:space="preserve">: Outlook s’ouvre.</w:t>
-      </w:r>
-    </w:p>
-    <w:bookmarkEnd w:id="22"/>
-    <w:bookmarkStart w:id="23" w:name="menvoyer-les-résultats"/>
-    <w:p>
-      <w:pPr>
-        <w:pStyle w:val="Heading2"/>
-      </w:pPr>
-      <w:r>
-        <w:t xml:space="preserve">4. M’envoyer les résultats</w:t>
-      </w:r>
-    </w:p>
-    <w:p>
-      <w:pPr>
         <w:numPr>
-          <w:ilvl w:val="0"/>
-          <w:numId w:val="1002"/>
-        </w:numPr>
-        <w:pStyle w:val="Compact"/>
-      </w:pPr>
-      <w:r>
-        <w:t xml:space="preserve">Envoyez la liste des ✅ et des ❌, avec une capture d’écran de ce qui ne fonctionne pas.</w:t>
-      </w:r>
-    </w:p>
-    <w:p>
-      <w:pPr>
-        <w:numPr>
-          <w:ilvl w:val="0"/>
-          <w:numId w:val="1002"/>
-        </w:numPr>
-        <w:pStyle w:val="Compact"/>
-      </w:pPr>
-      <w:r>
-        <w:t xml:space="preserve">Je corrige ce qui bloque, puis on construit ensemble le</w:t>
-      </w:r>
-      <w:r>
-        <w:t xml:space="preserve"> </w:t>
-      </w:r>
-      <w:r>
-        <w:rPr>
-          <w:bCs/>
-          <w:b/>
-        </w:rPr>
-        <w:t xml:space="preserve">flux Power Automate « AC - Traiter un dépôt »</w:t>
-      </w:r>
-      <w:r>
-        <w:t xml:space="preserve">, une étape à la fois. Sans ce flux, un dépôt reste dans la liste sans courriel ni dossier officiel.</w:t>
-      </w:r>
-    </w:p>
-    <w:bookmarkEnd w:id="23"/>
-    <w:bookmarkStart w:id="24" w:name="X53a8e03b67a126fc516fc2c491eef0647d355ba"/>
-    <w:p>
-      <w:pPr>
-        <w:pStyle w:val="Heading2"/>
-      </w:pPr>
-      <w:r>
-        <w:t xml:space="preserve">5. Questions à me répondre quand vous aurez un moment</w:t>
-      </w:r>
-    </w:p>
-    <w:p>
-      <w:pPr>
-        <w:numPr>
-          <w:ilvl w:val="0"/>
+          <w:ilvl w:val="1"/>
           <w:numId w:val="1003"/>
         </w:numPr>
         <w:pStyle w:val="Compact"/>
       </w:pPr>
       <w:r>
-        <w:rPr>
-          <w:bCs/>
-          <w:b/>
-        </w:rPr>
-        <w:t xml:space="preserve">Ordre des postures</w:t>
-      </w:r>
-      <w:r>
-        <w:t xml:space="preserve"> </w:t>
-      </w:r>
-      <w:r>
-        <w:t xml:space="preserve">: faut-il suivre le Word (Innovant avant Responsable) ? Aujourd’hui, l’application affiche Responsable avant Innovant.</w:t>
+        <w:t xml:space="preserve">l’ordre des postures (Innovant avant Responsable, comme dans le Word ?) ;</w:t>
       </w:r>
     </w:p>
     <w:p>
       <w:pPr>
         <w:numPr>
-          <w:ilvl w:val="0"/>
+          <w:ilvl w:val="1"/>
           <w:numId w:val="1003"/>
         </w:numPr>
         <w:pStyle w:val="Compact"/>
       </w:pPr>
       <w:r>
-        <w:rPr>
-          <w:bCs/>
-          <w:b/>
-        </w:rPr>
-        <w:t xml:space="preserve">Cadre sans équipe, section C</w:t>
-      </w:r>
-      <w:r>
-        <w:t xml:space="preserve"> </w:t>
-      </w:r>
-      <w:r>
-        <w:t xml:space="preserve">: faut-il garder la question du Word du 15 octobre (« …ayant fait l’objet d’actions ou d’efforts particuliers… ») ? C’est celle que j’ai mise.</w:t>
+        <w:t xml:space="preserve">la question de la section C du cadre sans équipe ;</w:t>
       </w:r>
     </w:p>
     <w:p>
       <w:pPr>
         <w:numPr>
-          <w:ilvl w:val="0"/>
+          <w:ilvl w:val="1"/>
           <w:numId w:val="1003"/>
         </w:numPr>
         <w:pStyle w:val="Compact"/>
       </w:pPr>
       <w:r>
-        <w:rPr>
-          <w:bCs/>
-          <w:b/>
-        </w:rPr>
-        <w:t xml:space="preserve">Virgule</w:t>
-      </w:r>
-      <w:r>
-        <w:t xml:space="preserve"> </w:t>
-      </w:r>
-      <w:r>
-        <w:t xml:space="preserve">: faut-il garder la virgule dans « Pour chacune des compétences suivantes, donnez… » ?</w:t>
+        <w:t xml:space="preserve">la virgule dans « suivantes, donnez ».</w:t>
       </w:r>
     </w:p>
-    <w:bookmarkEnd w:id="24"/>
-    <w:bookmarkStart w:id="25" w:name="ne-pas-faire"/>
-    <w:p>
-      <w:pPr>
-        <w:pStyle w:val="Heading2"/>
-      </w:pPr>
-      <w:r>
-        <w:t xml:space="preserve">Ne pas faire</w:t>
-      </w:r>
-    </w:p>
-    <w:p>
-      <w:pPr>
-        <w:numPr>
-          <w:ilvl w:val="0"/>
-          <w:numId w:val="1004"/>
-        </w:numPr>
-        <w:pStyle w:val="Compact"/>
-      </w:pPr>
-      <w:r>
-        <w:t xml:space="preserve">Ne pas mettre le fichier dans</w:t>
-      </w:r>
-      <w:r>
-        <w:t xml:space="preserve"> </w:t>
-      </w:r>
-      <w:r>
-        <w:rPr>
-          <w:bCs/>
-          <w:b/>
-        </w:rPr>
-        <w:t xml:space="preserve">Pages du site</w:t>
-      </w:r>
-      <w:r>
-        <w:t xml:space="preserve"> </w:t>
-      </w:r>
-      <w:r>
-        <w:t xml:space="preserve">: l’option « Page HTML » n’y est pas encore activée.</w:t>
-      </w:r>
-    </w:p>
-    <w:p>
-      <w:pPr>
-        <w:numPr>
-          <w:ilvl w:val="0"/>
-          <w:numId w:val="1004"/>
-        </w:numPr>
-        <w:pStyle w:val="Compact"/>
-      </w:pPr>
-      <w:r>
-        <w:t xml:space="preserve">Ne pas supprimer l’ancienne liste</w:t>
-      </w:r>
-      <w:r>
-        <w:t xml:space="preserve"> </w:t>
-      </w:r>
-      <w:r>
-        <w:rPr>
-          <w:bCs/>
-          <w:b/>
-        </w:rPr>
-        <w:t xml:space="preserve">AppreciationsCadres_Suivi</w:t>
-      </w:r>
-      <w:r>
-        <w:t xml:space="preserve"> </w:t>
-      </w:r>
-      <w:r>
-        <w:t xml:space="preserve">pour l’instant.</w:t>
-      </w:r>
-    </w:p>
-    <w:p>
-      <w:pPr>
-        <w:numPr>
-          <w:ilvl w:val="0"/>
-          <w:numId w:val="1004"/>
-        </w:numPr>
-        <w:pStyle w:val="Compact"/>
-      </w:pPr>
-      <w:r>
-        <w:t xml:space="preserve">Ne pas retirer le mot de passe de l’application, même si Copilot le suggère : il est déjà sauté automatiquement dans SharePoint.</w:t>
-      </w:r>
-    </w:p>
-    <w:bookmarkEnd w:id="25"/>
-    <w:bookmarkEnd w:id="26"/>
+    <w:bookmarkEnd w:id="20"/>
     <w:sectPr/>
   </w:body>
 </w:document>
@@ -701,82 +387,6 @@
       </w:pPr>
     </w:lvl>
   </w:abstractNum>
-  <w:abstractNum w:abstractNumId="991">
-    <w:nsid w:val="A991"/>
-    <w:multiLevelType w:val="multilevel"/>
-    <w:lvl w:ilvl="0">
-      <w:numFmt w:val="bullet"/>
-      <w:lvlText w:val="•"/>
-      <w:lvlJc w:val="left"/>
-      <w:pPr>
-        <w:ind w:left="720" w:hanging="480"/>
-      </w:pPr>
-    </w:lvl>
-    <w:lvl w:ilvl="1">
-      <w:numFmt w:val="bullet"/>
-      <w:lvlText w:val="–"/>
-      <w:lvlJc w:val="left"/>
-      <w:pPr>
-        <w:ind w:left="1440" w:hanging="480"/>
-      </w:pPr>
-    </w:lvl>
-    <w:lvl w:ilvl="2">
-      <w:numFmt w:val="bullet"/>
-      <w:lvlText w:val="•"/>
-      <w:lvlJc w:val="left"/>
-      <w:pPr>
-        <w:ind w:left="2160" w:hanging="480"/>
-      </w:pPr>
-    </w:lvl>
-    <w:lvl w:ilvl="3">
-      <w:numFmt w:val="bullet"/>
-      <w:lvlText w:val="–"/>
-      <w:lvlJc w:val="left"/>
-      <w:pPr>
-        <w:ind w:left="2880" w:hanging="480"/>
-      </w:pPr>
-    </w:lvl>
-    <w:lvl w:ilvl="4">
-      <w:numFmt w:val="bullet"/>
-      <w:lvlText w:val="•"/>
-      <w:lvlJc w:val="left"/>
-      <w:pPr>
-        <w:ind w:left="3600" w:hanging="480"/>
-      </w:pPr>
-    </w:lvl>
-    <w:lvl w:ilvl="5">
-      <w:numFmt w:val="bullet"/>
-      <w:lvlText w:val="–"/>
-      <w:lvlJc w:val="left"/>
-      <w:pPr>
-        <w:ind w:left="4320" w:hanging="480"/>
-      </w:pPr>
-    </w:lvl>
-    <w:lvl w:ilvl="6">
-      <w:numFmt w:val="bullet"/>
-      <w:lvlText w:val="•"/>
-      <w:lvlJc w:val="left"/>
-      <w:pPr>
-        <w:ind w:left="5040" w:hanging="480"/>
-      </w:pPr>
-    </w:lvl>
-    <w:lvl w:ilvl="7">
-      <w:numFmt w:val="bullet"/>
-      <w:lvlText w:val="–"/>
-      <w:lvlJc w:val="left"/>
-      <w:pPr>
-        <w:ind w:left="5760" w:hanging="480"/>
-      </w:pPr>
-    </w:lvl>
-    <w:lvl w:ilvl="8">
-      <w:numFmt w:val="bullet"/>
-      <w:lvlText w:val="•"/>
-      <w:lvlJc w:val="left"/>
-      <w:pPr>
-        <w:ind w:left="6480" w:hanging="480"/>
-      </w:pPr>
-    </w:lvl>
-  </w:abstractNum>
   <w:abstractNum w:abstractNumId="99411">
     <w:nsid w:val="A99411"/>
     <w:multiLevelType w:val="multilevel"/>
@@ -862,16 +472,86 @@
       </w:pPr>
     </w:lvl>
   </w:abstractNum>
+  <w:abstractNum w:abstractNumId="991">
+    <w:nsid w:val="A991"/>
+    <w:multiLevelType w:val="multilevel"/>
+    <w:lvl w:ilvl="0">
+      <w:numFmt w:val="bullet"/>
+      <w:lvlText w:val="•"/>
+      <w:lvlJc w:val="left"/>
+      <w:pPr>
+        <w:ind w:left="720" w:hanging="480"/>
+      </w:pPr>
+    </w:lvl>
+    <w:lvl w:ilvl="1">
+      <w:numFmt w:val="bullet"/>
+      <w:lvlText w:val="–"/>
+      <w:lvlJc w:val="left"/>
+      <w:pPr>
+        <w:ind w:left="1440" w:hanging="480"/>
+      </w:pPr>
+    </w:lvl>
+    <w:lvl w:ilvl="2">
+      <w:numFmt w:val="bullet"/>
+      <w:lvlText w:val="•"/>
+      <w:lvlJc w:val="left"/>
+      <w:pPr>
+        <w:ind w:left="2160" w:hanging="480"/>
+      </w:pPr>
+    </w:lvl>
+    <w:lvl w:ilvl="3">
+      <w:numFmt w:val="bullet"/>
+      <w:lvlText w:val="–"/>
+      <w:lvlJc w:val="left"/>
+      <w:pPr>
+        <w:ind w:left="2880" w:hanging="480"/>
+      </w:pPr>
+    </w:lvl>
+    <w:lvl w:ilvl="4">
+      <w:numFmt w:val="bullet"/>
+      <w:lvlText w:val="•"/>
+      <w:lvlJc w:val="left"/>
+      <w:pPr>
+        <w:ind w:left="3600" w:hanging="480"/>
+      </w:pPr>
+    </w:lvl>
+    <w:lvl w:ilvl="5">
+      <w:numFmt w:val="bullet"/>
+      <w:lvlText w:val="–"/>
+      <w:lvlJc w:val="left"/>
+      <w:pPr>
+        <w:ind w:left="4320" w:hanging="480"/>
+      </w:pPr>
+    </w:lvl>
+    <w:lvl w:ilvl="6">
+      <w:numFmt w:val="bullet"/>
+      <w:lvlText w:val="•"/>
+      <w:lvlJc w:val="left"/>
+      <w:pPr>
+        <w:ind w:left="5040" w:hanging="480"/>
+      </w:pPr>
+    </w:lvl>
+    <w:lvl w:ilvl="7">
+      <w:numFmt w:val="bullet"/>
+      <w:lvlText w:val="–"/>
+      <w:lvlJc w:val="left"/>
+      <w:pPr>
+        <w:ind w:left="5760" w:hanging="480"/>
+      </w:pPr>
+    </w:lvl>
+    <w:lvl w:ilvl="8">
+      <w:numFmt w:val="bullet"/>
+      <w:lvlText w:val="•"/>
+      <w:lvlJc w:val="left"/>
+      <w:pPr>
+        <w:ind w:left="6480" w:hanging="480"/>
+      </w:pPr>
+    </w:lvl>
+  </w:abstractNum>
   <w:num w:numId="1000">
     <w:abstractNumId w:val="990"/>
   </w:num>
   <w:num w:numId="1001">
-    <w:abstractNumId w:val="991"/>
-  </w:num>
-  <w:num w:numId="1002">
-    <w:abstractNumId w:val="991"/>
-  </w:num>
-  <w:num w:numId="1003">
     <w:abstractNumId w:val="99411"/>
     <w:lvlOverride w:ilvl="0">
       <w:startOverride w:val="1"/>
@@ -901,7 +581,10 @@
       <w:startOverride w:val="1"/>
     </w:lvlOverride>
   </w:num>
-  <w:num w:numId="1004">
+  <w:num w:numId="1002">
+    <w:abstractNumId w:val="991"/>
+  </w:num>
+  <w:num w:numId="1003">
     <w:abstractNumId w:val="991"/>
   </w:num>
 </w:numbering>

</xml_diff>

<commit_message>
Appréciation v3.5 : affichage allégé
- Choix du rôle (écran « Qui êtes-vous ? »), verrouillé jusqu'à Nouveau formulaire ;
  les sections d'un autre rôle sont cachées tant qu'elles sont vides
- Aide-mémoire et « Comment remplir » fusionnés, mis en évidence ; rappel de l'échelle retiré
- Numéro de dossier affiché seulement quand SharePoint connaît le dossier
- Bouton Configuration retiré ; version au pied de page et au bas du PDF seulement

Co-Authored-By: Claude Opus 5.5 <noreply@anthropic.com>
Claude-Session: https://claude.ai/code/session_01FRdAzq8p3F9gJJe5MA3G79
</commit_message>
<xml_diff>
--- a/sharepoint-html-kit/appreciation/A-FAIRE-DEMAIN.docx
+++ b/sharepoint-html-kit/appreciation/A-FAIRE-DEMAIN.docx
@@ -39,28 +39,13 @@
         <w:rPr>
           <w:rStyle w:val="VerbatimChar"/>
         </w:rPr>
-        <w:t xml:space="preserve">appreciation-cadres-v3.4.html</w:t>
+        <w:t xml:space="preserve">appreciation-cadres-v3.5.html</w:t>
       </w:r>
       <w:r>
         <w:t xml:space="preserve"> </w:t>
       </w:r>
       <w:r>
-        <w:t xml:space="preserve">dans la bibliothèque. Supprimez ensuite l’ancien</w:t>
-      </w:r>
-      <w:r>
-        <w:t xml:space="preserve"> </w:t>
-      </w:r>
-      <w:r>
-        <w:rPr>
-          <w:rStyle w:val="VerbatimChar"/>
-        </w:rPr>
-        <w:t xml:space="preserve">appreciation-cadres-v3.3.html</w:t>
-      </w:r>
-      <w:r>
-        <w:t xml:space="preserve"> </w:t>
-      </w:r>
-      <w:r>
-        <w:t xml:space="preserve">: le nom a changé, il n’y a donc rien à remplacer.</w:t>
+        <w:t xml:space="preserve">dans la bibliothèque. Supprimez ensuite les anciens (v3.3, v3.4) : le nom a changé, il n’y a donc rien à remplacer.</w:t>
       </w:r>
     </w:p>
     <w:p>
@@ -125,7 +110,23 @@
         <w:pStyle w:val="Compact"/>
       </w:pPr>
       <w:r>
-        <w:t xml:space="preserve">créer le mot de passe ;</w:t>
+        <w:t xml:space="preserve">créer le mot de passe, choisir le type de poste, puis</w:t>
+      </w:r>
+      <w:r>
+        <w:t xml:space="preserve"> </w:t>
+      </w:r>
+      <w:r>
+        <w:rPr>
+          <w:bCs/>
+          <w:b/>
+        </w:rPr>
+        <w:t xml:space="preserve">qui vous êtes</w:t>
+      </w:r>
+      <w:r>
+        <w:t xml:space="preserve"> </w:t>
+      </w:r>
+      <w:r>
+        <w:t xml:space="preserve">;</w:t>
       </w:r>
     </w:p>
     <w:p>
@@ -237,47 +238,7 @@
         <w:pStyle w:val="Compact"/>
       </w:pPr>
       <w:r>
-        <w:rPr>
-          <w:bCs/>
-          <w:b/>
-        </w:rPr>
-        <w:t xml:space="preserve">Répondre aux 3 questions :</w:t>
-      </w:r>
-    </w:p>
-    <w:p>
-      <w:pPr>
-        <w:numPr>
-          <w:ilvl w:val="1"/>
-          <w:numId w:val="1003"/>
-        </w:numPr>
-        <w:pStyle w:val="Compact"/>
-      </w:pPr>
-      <w:r>
-        <w:t xml:space="preserve">l’ordre des postures (Innovant avant Responsable, comme dans le Word ?) ;</w:t>
-      </w:r>
-    </w:p>
-    <w:p>
-      <w:pPr>
-        <w:numPr>
-          <w:ilvl w:val="1"/>
-          <w:numId w:val="1003"/>
-        </w:numPr>
-        <w:pStyle w:val="Compact"/>
-      </w:pPr>
-      <w:r>
-        <w:t xml:space="preserve">la question de la section C du cadre sans équipe ;</w:t>
-      </w:r>
-    </w:p>
-    <w:p>
-      <w:pPr>
-        <w:numPr>
-          <w:ilvl w:val="1"/>
-          <w:numId w:val="1003"/>
-        </w:numPr>
-        <w:pStyle w:val="Compact"/>
-      </w:pPr>
-      <w:r>
-        <w:t xml:space="preserve">la virgule dans « suivantes, donnez ».</w:t>
+        <w:t xml:space="preserve">✅ Les 3 questions sont réglées : ordre PBRI conservé, question du Word gardée, virgule gardée.</w:t>
       </w:r>
     </w:p>
     <w:bookmarkEnd w:id="20"/>
@@ -582,9 +543,6 @@
     </w:lvlOverride>
   </w:num>
   <w:num w:numId="1002">
-    <w:abstractNumId w:val="991"/>
-  </w:num>
-  <w:num w:numId="1003">
     <w:abstractNumId w:val="991"/>
   </w:num>
 </w:numbering>

</xml_diff>